<commit_message>
docs(po): update sprint 3-4 kanban from latest team changes
</commit_message>
<xml_diff>
--- a/docs/PO_work/PO_Kanban_Board_Sprint3-4.docx
+++ b/docs/PO_work/PO_Kanban_Board_Sprint3-4.docx
@@ -9,7 +9,7 @@
     </w:p>
     <w:p>
       <w:r>
-        <w:t>Updated on April 1, 2026 by Z-X-hub (Edison) based on team commits from March 31, 2026 to April 1, 2026.</w:t>
+        <w:t>Updated on April 2, 2026 by Z-X-hub (Edison) based on team commits from April 1, 2026 to April 2, 2026.</w:t>
       </w:r>
     </w:p>
     <w:p>
@@ -19,7 +19,7 @@
     </w:p>
     <w:p>
       <w:r>
-        <w:t>This board is maintained from the Product Owner perspective to keep Sprint 3-4 aligned with the GitHub sprint-3-4 issue scope and the current main-branch delivery state. Done means the work is merged into main and supported by concrete verification signals. This update is based on the team delivery window (2026-03-31 to 2026-04-01) across Tianbo Cao, Zixuan135, coldwinding-alt, Chengzeng-Zane, Weirdo1111, and Z-X-hub. On April 1, 2026, npm run test passed with 25 passing files and 82 passing tests.</w:t>
+        <w:t>This board is maintained from the Product Owner perspective to keep Sprint 3-4 aligned with the GitHub sprint-3-4 issue scope and the current main-branch delivery state. Done means the work is merged into main and supported by concrete verification signals. This update is based on the team delivery window (2026-04-01 to 2026-04-02) across Chengzeng-Zane, Tianbo Cao, Z-X-hub, Zixuan135, and Weirdo1111. On April 2, 2026, npm test passed with 26 passing files and 83 passing tests.</w:t>
       </w:r>
     </w:p>
     <w:p>
@@ -609,12 +609,152 @@
     </w:p>
     <w:p>
       <w:r>
+        <w:t>Done</w:t>
+      </w:r>
+    </w:p>
+    <w:p>
+      <w:r>
+        <w:t>Listening test module with random TED pair and score flow</w:t>
+      </w:r>
+    </w:p>
+    <w:p>
+      <w:r>
+        <w:t>Listening / assessment</w:t>
+      </w:r>
+    </w:p>
+    <w:p>
+      <w:r>
+        <w:t>A dedicated listening test entry now samples two talks from the 60-talk TED pool and scores learner answers in-app, with practice and test sharing the same prompt structure.</w:t>
+      </w:r>
+    </w:p>
+    <w:p>
+      <w:r>
+        <w:t>Done</w:t>
+      </w:r>
+    </w:p>
+    <w:p>
+      <w:r>
+        <w:t>Voice-to-text answering support in listening practice and test</w:t>
+      </w:r>
+    </w:p>
+    <w:p>
+      <w:r>
+        <w:t>Listening / speech input</w:t>
+      </w:r>
+    </w:p>
+    <w:p>
+      <w:r>
+        <w:t>Speech-to-text input from speaking flow is now reused for listening answers without removing the original speaking module capability.</w:t>
+      </w:r>
+    </w:p>
+    <w:p>
+      <w:r>
+        <w:t>Done</w:t>
+      </w:r>
+    </w:p>
+    <w:p>
+      <w:r>
+        <w:t>Listening filter simplification and card alignment polish</w:t>
+      </w:r>
+    </w:p>
+    <w:p>
+      <w:r>
+        <w:t>Listening / UI</w:t>
+      </w:r>
+    </w:p>
+    <w:p>
+      <w:r>
+        <w:t>Library header now keeps only title and language switch, filters focus on search plus major, accent, and difficulty lanes, cross-disciplinary filter is reduced to one chip, and card alignment inconsistencies were corrected.</w:t>
+      </w:r>
+    </w:p>
+    <w:p>
+      <w:r>
+        <w:t>Done</w:t>
+      </w:r>
+    </w:p>
+    <w:p>
+      <w:r>
+        <w:t>Buddy and XP regression recovery after branch merges</w:t>
+      </w:r>
+    </w:p>
+    <w:p>
+      <w:r>
+        <w:t>Home / buddy system</w:t>
+      </w:r>
+    </w:p>
+    <w:p>
+      <w:r>
+        <w:t>Desktop buddy mount, local identity sync, and progress data reconciliation were restored, reducing the risk that teammate changes get overwritten by listening updates.</w:t>
+      </w:r>
+    </w:p>
+    <w:p>
+      <w:r>
+        <w:t>Done</w:t>
+      </w:r>
+    </w:p>
+    <w:p>
+      <w:r>
+        <w:t>Homepage hero polish and debug-noise cleanup</w:t>
+      </w:r>
+    </w:p>
+    <w:p>
+      <w:r>
+        <w:t>Home / visual system</w:t>
+      </w:r>
+    </w:p>
+    <w:p>
+      <w:r>
+        <w:t>Homepage layout spacing was refined and debug information was hidden to keep the main learning entry cleaner.</w:t>
+      </w:r>
+    </w:p>
+    <w:p>
+      <w:r>
+        <w:t>Done</w:t>
+      </w:r>
+    </w:p>
+    <w:p>
+      <w:r>
+        <w:t>Word-game recovery and rules modal readability refinements</w:t>
+      </w:r>
+    </w:p>
+    <w:p>
+      <w:r>
+        <w:t>Game Center / gameplay quality</w:t>
+      </w:r>
+    </w:p>
+    <w:p>
+      <w:r>
+        <w:t>Battle HUD controls, readability, Chinese meaning support, in-battle recovery modal sizing, and landing modal border polish were merged in a continuous iteration lane.</w:t>
+      </w:r>
+    </w:p>
+    <w:p>
+      <w:r>
+        <w:t>Review / Testing</w:t>
+      </w:r>
+    </w:p>
+    <w:p>
+      <w:r>
+        <w:t>Cross-module smoke verification after rapid merge train</w:t>
+      </w:r>
+    </w:p>
+    <w:p>
+      <w:r>
+        <w:t>Product integration / QA</w:t>
+      </w:r>
+    </w:p>
+    <w:p>
+      <w:r>
+        <w:t>Because word game, buddy progression, homepage shell, and listening all changed in the same window, one full smoke pass is still required before final sprint closure.</w:t>
+      </w:r>
+    </w:p>
+    <w:p>
+      <w:r>
         <w:t>PO Note</w:t>
       </w:r>
     </w:p>
     <w:p>
       <w:r>
-        <w:t>The last two days show clear team-wide delivery momentum across seminars, DB/persistence, auth, game center, and listening. The next Product Owner control point is to keep scope disciplined: finish acceptance, lint/quality closure, and cross-module persistence consistency before opening new realtime economy or large social expansions.</w:t>
+        <w:t>The past 48 hours delivered visible team-wide progress in word game depth, buddy reliability, homepage polish, and listening assessment capability. The next Product Owner checkpoint is controlled integration testing across modules and disciplined issue-state sync on the web Kanban.</w:t>
       </w:r>
     </w:p>
     <w:p>

</xml_diff>